<commit_message>
Update Portfolio 2 documentation and optimisation evidence
</commit_message>
<xml_diff>
--- a/Okwusogu_Mary_301903956_portfolio-2-query-optimisation/Okwusogu_Mary_301903956_optimization_evidence_screenshots/Okwusogu_Mary_301903956_Query1_Screenshots.docx
+++ b/Okwusogu_Mary_301903956_portfolio-2-query-optimisation/Okwusogu_Mary_301903956_optimization_evidence_screenshots/Okwusogu_Mary_301903956_Query1_Screenshots.docx
@@ -371,7 +371,31 @@
           <w:szCs w:val="22"/>
           <w14:ligatures w14:val="none"/>
         </w:rPr>
-        <w:t>financial_transaction.transaction_status</w:t>
+        <w:t>financial_</w:t>
+      </w:r>
+      <w:proofErr w:type="gramStart"/>
+      <w:r>
+        <w:rPr>
+          <w:rFonts w:ascii="Aptos Narrow" w:eastAsia="Times New Roman" w:hAnsi="Aptos Narrow" w:cs="Times New Roman"/>
+          <w:color w:val="000000"/>
+          <w:kern w:val="0"/>
+          <w:sz w:val="22"/>
+          <w:szCs w:val="22"/>
+          <w14:ligatures w14:val="none"/>
+        </w:rPr>
+        <w:t>transaction.transaction</w:t>
+      </w:r>
+      <w:proofErr w:type="gramEnd"/>
+      <w:r>
+        <w:rPr>
+          <w:rFonts w:ascii="Aptos Narrow" w:eastAsia="Times New Roman" w:hAnsi="Aptos Narrow" w:cs="Times New Roman"/>
+          <w:color w:val="000000"/>
+          <w:kern w:val="0"/>
+          <w:sz w:val="22"/>
+          <w:szCs w:val="22"/>
+          <w14:ligatures w14:val="none"/>
+        </w:rPr>
+        <w:t>_status</w:t>
       </w:r>
       <w:proofErr w:type="spellEnd"/>
       <w:r>
@@ -383,19 +407,56 @@
           <w:szCs w:val="22"/>
           <w14:ligatures w14:val="none"/>
         </w:rPr>
-        <w:t xml:space="preserve"> = 'POSTED') and (cast(</w:t>
+        <w:t xml:space="preserve"> = 'POSTED') and (</w:t>
+      </w:r>
+      <w:proofErr w:type="gramStart"/>
+      <w:r>
+        <w:rPr>
+          <w:rFonts w:ascii="Aptos Narrow" w:eastAsia="Times New Roman" w:hAnsi="Aptos Narrow" w:cs="Times New Roman"/>
+          <w:color w:val="000000"/>
+          <w:kern w:val="0"/>
+          <w:sz w:val="22"/>
+          <w:szCs w:val="22"/>
+          <w14:ligatures w14:val="none"/>
+        </w:rPr>
+        <w:t>cast(</w:t>
       </w:r>
       <w:proofErr w:type="spellStart"/>
-      <w:r>
-        <w:rPr>
-          <w:rFonts w:ascii="Aptos Narrow" w:eastAsia="Times New Roman" w:hAnsi="Aptos Narrow" w:cs="Times New Roman"/>
-          <w:color w:val="000000"/>
-          <w:kern w:val="0"/>
-          <w:sz w:val="22"/>
-          <w:szCs w:val="22"/>
-          <w14:ligatures w14:val="none"/>
-        </w:rPr>
-        <w:t>financial_transaction.created_at</w:t>
+      <w:proofErr w:type="gramEnd"/>
+      <w:r>
+        <w:rPr>
+          <w:rFonts w:ascii="Aptos Narrow" w:eastAsia="Times New Roman" w:hAnsi="Aptos Narrow" w:cs="Times New Roman"/>
+          <w:color w:val="000000"/>
+          <w:kern w:val="0"/>
+          <w:sz w:val="22"/>
+          <w:szCs w:val="22"/>
+          <w14:ligatures w14:val="none"/>
+        </w:rPr>
+        <w:t>financial_</w:t>
+      </w:r>
+      <w:proofErr w:type="gramStart"/>
+      <w:r>
+        <w:rPr>
+          <w:rFonts w:ascii="Aptos Narrow" w:eastAsia="Times New Roman" w:hAnsi="Aptos Narrow" w:cs="Times New Roman"/>
+          <w:color w:val="000000"/>
+          <w:kern w:val="0"/>
+          <w:sz w:val="22"/>
+          <w:szCs w:val="22"/>
+          <w14:ligatures w14:val="none"/>
+        </w:rPr>
+        <w:t>transaction.created</w:t>
+      </w:r>
+      <w:proofErr w:type="gramEnd"/>
+      <w:r>
+        <w:rPr>
+          <w:rFonts w:ascii="Aptos Narrow" w:eastAsia="Times New Roman" w:hAnsi="Aptos Narrow" w:cs="Times New Roman"/>
+          <w:color w:val="000000"/>
+          <w:kern w:val="0"/>
+          <w:sz w:val="22"/>
+          <w:szCs w:val="22"/>
+          <w14:ligatures w14:val="none"/>
+        </w:rPr>
+        <w:t>_at</w:t>
       </w:r>
       <w:proofErr w:type="spellEnd"/>
       <w:r>
@@ -407,7 +468,55 @@
           <w:szCs w:val="22"/>
           <w14:ligatures w14:val="none"/>
         </w:rPr>
-        <w:t xml:space="preserve"> as date) = '2026-02-27'))  (cost=51.2 rows=500) (actual time=0.697..0.97 rows=18 loops=1)</w:t>
+        <w:t xml:space="preserve"> as date) = '2026-02-27'</w:t>
+      </w:r>
+      <w:proofErr w:type="gramStart"/>
+      <w:r>
+        <w:rPr>
+          <w:rFonts w:ascii="Aptos Narrow" w:eastAsia="Times New Roman" w:hAnsi="Aptos Narrow" w:cs="Times New Roman"/>
+          <w:color w:val="000000"/>
+          <w:kern w:val="0"/>
+          <w:sz w:val="22"/>
+          <w:szCs w:val="22"/>
+          <w14:ligatures w14:val="none"/>
+        </w:rPr>
+        <w:t>))  (</w:t>
+      </w:r>
+      <w:proofErr w:type="gramEnd"/>
+      <w:r>
+        <w:rPr>
+          <w:rFonts w:ascii="Aptos Narrow" w:eastAsia="Times New Roman" w:hAnsi="Aptos Narrow" w:cs="Times New Roman"/>
+          <w:color w:val="000000"/>
+          <w:kern w:val="0"/>
+          <w:sz w:val="22"/>
+          <w:szCs w:val="22"/>
+          <w14:ligatures w14:val="none"/>
+        </w:rPr>
+        <w:t>cost=51.2 rows=500) (actual time=</w:t>
+      </w:r>
+      <w:proofErr w:type="gramStart"/>
+      <w:r>
+        <w:rPr>
+          <w:rFonts w:ascii="Aptos Narrow" w:eastAsia="Times New Roman" w:hAnsi="Aptos Narrow" w:cs="Times New Roman"/>
+          <w:color w:val="000000"/>
+          <w:kern w:val="0"/>
+          <w:sz w:val="22"/>
+          <w:szCs w:val="22"/>
+          <w14:ligatures w14:val="none"/>
+        </w:rPr>
+        <w:t>0.697..</w:t>
+      </w:r>
+      <w:proofErr w:type="gramEnd"/>
+      <w:r>
+        <w:rPr>
+          <w:rFonts w:ascii="Aptos Narrow" w:eastAsia="Times New Roman" w:hAnsi="Aptos Narrow" w:cs="Times New Roman"/>
+          <w:color w:val="000000"/>
+          <w:kern w:val="0"/>
+          <w:sz w:val="22"/>
+          <w:szCs w:val="22"/>
+          <w14:ligatures w14:val="none"/>
+        </w:rPr>
+        <w:t>0.97 rows=18 loops=1)</w:t>
       </w:r>
       <w:r>
         <w:rPr>
@@ -509,6 +618,9 @@
     </w:p>
     <w:p>
       <w:r>
+        <w:rPr>
+          <w:noProof/>
+        </w:rPr>
         <w:drawing>
           <wp:inline distT="0" distB="0" distL="0" distR="0" wp14:anchorId="084260A0" wp14:editId="7F4483BD">
             <wp:extent cx="5760720" cy="3217633"/>
@@ -568,14 +680,7 @@
           <w:b/>
           <w:bCs/>
         </w:rPr>
-        <w:t xml:space="preserve">Analysis </w:t>
-      </w:r>
-      <w:r>
-        <w:rPr>
-          <w:b/>
-          <w:bCs/>
-        </w:rPr>
-        <w:t>After</w:t>
+        <w:t>Analysis After</w:t>
       </w:r>
     </w:p>
     <w:p>
@@ -930,6 +1035,7 @@
       <w:r>
         <w:rPr>
           <w:rFonts w:ascii="Times New Roman" w:eastAsia="Times New Roman" w:hAnsi="Times New Roman" w:cs="Times New Roman"/>
+          <w:noProof/>
           <w:kern w:val="0"/>
           <w14:ligatures w14:val="none"/>
         </w:rPr>
@@ -981,6 +1087,591 @@
         </w:rPr>
       </w:pPr>
     </w:p>
+    <w:p/>
+    <w:p>
+      <w:pPr>
+        <w:rPr>
+          <w:b/>
+          <w:bCs/>
+        </w:rPr>
+      </w:pPr>
+      <w:r>
+        <w:rPr>
+          <w:b/>
+          <w:bCs/>
+        </w:rPr>
+        <w:t>Execution plan comparison</w:t>
+      </w:r>
+    </w:p>
+    <w:tbl>
+      <w:tblPr>
+        <w:tblW w:w="0" w:type="auto"/>
+        <w:tblCellSpacing w:w="15" w:type="dxa"/>
+        <w:tblBorders>
+          <w:top w:val="single" w:sz="4" w:space="0" w:color="auto"/>
+          <w:left w:val="single" w:sz="4" w:space="0" w:color="auto"/>
+          <w:bottom w:val="single" w:sz="4" w:space="0" w:color="auto"/>
+          <w:right w:val="single" w:sz="4" w:space="0" w:color="auto"/>
+          <w:insideH w:val="single" w:sz="4" w:space="0" w:color="auto"/>
+          <w:insideV w:val="single" w:sz="4" w:space="0" w:color="auto"/>
+        </w:tblBorders>
+        <w:tblCellMar>
+          <w:top w:w="15" w:type="dxa"/>
+          <w:left w:w="15" w:type="dxa"/>
+          <w:bottom w:w="15" w:type="dxa"/>
+          <w:right w:w="15" w:type="dxa"/>
+        </w:tblCellMar>
+        <w:tblLook w:val="04A0" w:firstRow="1" w:lastRow="0" w:firstColumn="1" w:lastColumn="0" w:noHBand="0" w:noVBand="1"/>
+      </w:tblPr>
+      <w:tblGrid>
+        <w:gridCol w:w="2515"/>
+        <w:gridCol w:w="2522"/>
+        <w:gridCol w:w="4313"/>
+      </w:tblGrid>
+      <w:tr>
+        <w:trPr>
+          <w:tblCellSpacing w:w="15" w:type="dxa"/>
+        </w:trPr>
+        <w:tc>
+          <w:tcPr>
+            <w:tcW w:w="2470" w:type="dxa"/>
+            <w:vAlign w:val="center"/>
+            <w:hideMark/>
+          </w:tcPr>
+          <w:p>
+            <w:pPr>
+              <w:rPr>
+                <w:b/>
+                <w:bCs/>
+              </w:rPr>
+            </w:pPr>
+            <w:r>
+              <w:rPr>
+                <w:b/>
+                <w:bCs/>
+              </w:rPr>
+              <w:t>Measure</w:t>
+            </w:r>
+          </w:p>
+        </w:tc>
+        <w:tc>
+          <w:tcPr>
+            <w:tcW w:w="2492" w:type="dxa"/>
+            <w:vAlign w:val="center"/>
+            <w:hideMark/>
+          </w:tcPr>
+          <w:p>
+            <w:pPr>
+              <w:rPr>
+                <w:b/>
+                <w:bCs/>
+              </w:rPr>
+            </w:pPr>
+            <w:r>
+              <w:rPr>
+                <w:b/>
+                <w:bCs/>
+              </w:rPr>
+              <w:t xml:space="preserve">Before </w:t>
+            </w:r>
+            <w:proofErr w:type="spellStart"/>
+            <w:r>
+              <w:rPr>
+                <w:b/>
+                <w:bCs/>
+              </w:rPr>
+              <w:t>Optimisation</w:t>
+            </w:r>
+            <w:proofErr w:type="spellEnd"/>
+          </w:p>
+        </w:tc>
+        <w:tc>
+          <w:tcPr>
+            <w:tcW w:w="0" w:type="auto"/>
+            <w:vAlign w:val="center"/>
+            <w:hideMark/>
+          </w:tcPr>
+          <w:p>
+            <w:pPr>
+              <w:rPr>
+                <w:b/>
+                <w:bCs/>
+              </w:rPr>
+            </w:pPr>
+            <w:r>
+              <w:rPr>
+                <w:b/>
+                <w:bCs/>
+              </w:rPr>
+              <w:t xml:space="preserve">After </w:t>
+            </w:r>
+            <w:proofErr w:type="spellStart"/>
+            <w:r>
+              <w:rPr>
+                <w:b/>
+                <w:bCs/>
+              </w:rPr>
+              <w:t>Optimisation</w:t>
+            </w:r>
+            <w:proofErr w:type="spellEnd"/>
+          </w:p>
+        </w:tc>
+      </w:tr>
+      <w:tr>
+        <w:trPr>
+          <w:tblCellSpacing w:w="15" w:type="dxa"/>
+        </w:trPr>
+        <w:tc>
+          <w:tcPr>
+            <w:tcW w:w="2470" w:type="dxa"/>
+            <w:vAlign w:val="center"/>
+            <w:hideMark/>
+          </w:tcPr>
+          <w:p>
+            <w:r>
+              <w:t>Date filter</w:t>
+            </w:r>
+          </w:p>
+        </w:tc>
+        <w:tc>
+          <w:tcPr>
+            <w:tcW w:w="2492" w:type="dxa"/>
+            <w:vAlign w:val="center"/>
+            <w:hideMark/>
+          </w:tcPr>
+          <w:p>
+            <w:proofErr w:type="gramStart"/>
+            <w:r>
+              <w:t>DATE(</w:t>
+            </w:r>
+            <w:proofErr w:type="spellStart"/>
+            <w:proofErr w:type="gramEnd"/>
+            <w:r>
+              <w:t>created_at</w:t>
+            </w:r>
+            <w:proofErr w:type="spellEnd"/>
+            <w:r>
+              <w:t>) = '2026-02-27'</w:t>
+            </w:r>
+          </w:p>
+        </w:tc>
+        <w:tc>
+          <w:tcPr>
+            <w:tcW w:w="0" w:type="auto"/>
+            <w:vAlign w:val="center"/>
+            <w:hideMark/>
+          </w:tcPr>
+          <w:p>
+            <w:proofErr w:type="spellStart"/>
+            <w:r>
+              <w:t>created_at</w:t>
+            </w:r>
+            <w:proofErr w:type="spellEnd"/>
+            <w:r>
+              <w:t xml:space="preserve"> &gt;= '2026-02-27 00:00:00' AND </w:t>
+            </w:r>
+            <w:proofErr w:type="spellStart"/>
+            <w:r>
+              <w:t>created_at</w:t>
+            </w:r>
+            <w:proofErr w:type="spellEnd"/>
+            <w:r>
+              <w:t xml:space="preserve"> &lt; '2026-02-28 00:00:00'</w:t>
+            </w:r>
+          </w:p>
+        </w:tc>
+      </w:tr>
+      <w:tr>
+        <w:trPr>
+          <w:tblCellSpacing w:w="15" w:type="dxa"/>
+        </w:trPr>
+        <w:tc>
+          <w:tcPr>
+            <w:tcW w:w="2470" w:type="dxa"/>
+            <w:vAlign w:val="center"/>
+            <w:hideMark/>
+          </w:tcPr>
+          <w:p>
+            <w:r>
+              <w:t>Access method</w:t>
+            </w:r>
+          </w:p>
+        </w:tc>
+        <w:tc>
+          <w:tcPr>
+            <w:tcW w:w="2492" w:type="dxa"/>
+            <w:vAlign w:val="center"/>
+            <w:hideMark/>
+          </w:tcPr>
+          <w:p>
+            <w:r>
+              <w:t>Full table scan</w:t>
+            </w:r>
+          </w:p>
+        </w:tc>
+        <w:tc>
+          <w:tcPr>
+            <w:tcW w:w="0" w:type="auto"/>
+            <w:vAlign w:val="center"/>
+            <w:hideMark/>
+          </w:tcPr>
+          <w:p>
+            <w:r>
+              <w:t>Index range scan</w:t>
+            </w:r>
+          </w:p>
+        </w:tc>
+      </w:tr>
+      <w:tr>
+        <w:trPr>
+          <w:tblCellSpacing w:w="15" w:type="dxa"/>
+        </w:trPr>
+        <w:tc>
+          <w:tcPr>
+            <w:tcW w:w="2470" w:type="dxa"/>
+            <w:vAlign w:val="center"/>
+            <w:hideMark/>
+          </w:tcPr>
+          <w:p>
+            <w:r>
+              <w:t>Index used</w:t>
+            </w:r>
+          </w:p>
+        </w:tc>
+        <w:tc>
+          <w:tcPr>
+            <w:tcW w:w="2492" w:type="dxa"/>
+            <w:vAlign w:val="center"/>
+            <w:hideMark/>
+          </w:tcPr>
+          <w:p>
+            <w:r>
+              <w:t>None selected</w:t>
+            </w:r>
+          </w:p>
+        </w:tc>
+        <w:tc>
+          <w:tcPr>
+            <w:tcW w:w="0" w:type="auto"/>
+            <w:vAlign w:val="center"/>
+            <w:hideMark/>
+          </w:tcPr>
+          <w:p>
+            <w:proofErr w:type="spellStart"/>
+            <w:r>
+              <w:t>idx_transaction_status_time</w:t>
+            </w:r>
+            <w:proofErr w:type="spellEnd"/>
+          </w:p>
+        </w:tc>
+      </w:tr>
+      <w:tr>
+        <w:trPr>
+          <w:tblCellSpacing w:w="15" w:type="dxa"/>
+        </w:trPr>
+        <w:tc>
+          <w:tcPr>
+            <w:tcW w:w="2470" w:type="dxa"/>
+            <w:vAlign w:val="center"/>
+            <w:hideMark/>
+          </w:tcPr>
+          <w:p>
+            <w:r>
+              <w:t>Rows examined by access step</w:t>
+            </w:r>
+          </w:p>
+        </w:tc>
+        <w:tc>
+          <w:tcPr>
+            <w:tcW w:w="2492" w:type="dxa"/>
+            <w:vAlign w:val="center"/>
+            <w:hideMark/>
+          </w:tcPr>
+          <w:p>
+            <w:r>
+              <w:t>500</w:t>
+            </w:r>
+          </w:p>
+        </w:tc>
+        <w:tc>
+          <w:tcPr>
+            <w:tcW w:w="0" w:type="auto"/>
+            <w:vAlign w:val="center"/>
+            <w:hideMark/>
+          </w:tcPr>
+          <w:p>
+            <w:r>
+              <w:t>18 matching rows</w:t>
+            </w:r>
+          </w:p>
+        </w:tc>
+      </w:tr>
+      <w:tr>
+        <w:trPr>
+          <w:tblCellSpacing w:w="15" w:type="dxa"/>
+        </w:trPr>
+        <w:tc>
+          <w:tcPr>
+            <w:tcW w:w="2470" w:type="dxa"/>
+            <w:vAlign w:val="center"/>
+            <w:hideMark/>
+          </w:tcPr>
+          <w:p>
+            <w:r>
+              <w:t>Rows returned</w:t>
+            </w:r>
+          </w:p>
+        </w:tc>
+        <w:tc>
+          <w:tcPr>
+            <w:tcW w:w="2492" w:type="dxa"/>
+            <w:vAlign w:val="center"/>
+            <w:hideMark/>
+          </w:tcPr>
+          <w:p>
+            <w:r>
+              <w:t>18</w:t>
+            </w:r>
+          </w:p>
+        </w:tc>
+        <w:tc>
+          <w:tcPr>
+            <w:tcW w:w="0" w:type="auto"/>
+            <w:vAlign w:val="center"/>
+            <w:hideMark/>
+          </w:tcPr>
+          <w:p>
+            <w:r>
+              <w:t>18</w:t>
+            </w:r>
+          </w:p>
+        </w:tc>
+      </w:tr>
+      <w:tr>
+        <w:trPr>
+          <w:tblCellSpacing w:w="15" w:type="dxa"/>
+        </w:trPr>
+        <w:tc>
+          <w:tcPr>
+            <w:tcW w:w="2470" w:type="dxa"/>
+            <w:vAlign w:val="center"/>
+            <w:hideMark/>
+          </w:tcPr>
+          <w:p>
+            <w:r>
+              <w:t>Estimated optimizer cost</w:t>
+            </w:r>
+          </w:p>
+        </w:tc>
+        <w:tc>
+          <w:tcPr>
+            <w:tcW w:w="2492" w:type="dxa"/>
+            <w:vAlign w:val="center"/>
+            <w:hideMark/>
+          </w:tcPr>
+          <w:p>
+            <w:r>
+              <w:t>51.2</w:t>
+            </w:r>
+          </w:p>
+        </w:tc>
+        <w:tc>
+          <w:tcPr>
+            <w:tcW w:w="0" w:type="auto"/>
+            <w:vAlign w:val="center"/>
+            <w:hideMark/>
+          </w:tcPr>
+          <w:p>
+            <w:r>
+              <w:t>8.36</w:t>
+            </w:r>
+          </w:p>
+        </w:tc>
+      </w:tr>
+      <w:tr>
+        <w:trPr>
+          <w:tblCellSpacing w:w="15" w:type="dxa"/>
+        </w:trPr>
+        <w:tc>
+          <w:tcPr>
+            <w:tcW w:w="2470" w:type="dxa"/>
+            <w:vAlign w:val="center"/>
+            <w:hideMark/>
+          </w:tcPr>
+          <w:p>
+            <w:r>
+              <w:t>Actual execution time</w:t>
+            </w:r>
+          </w:p>
+        </w:tc>
+        <w:tc>
+          <w:tcPr>
+            <w:tcW w:w="2492" w:type="dxa"/>
+            <w:vAlign w:val="center"/>
+            <w:hideMark/>
+          </w:tcPr>
+          <w:p>
+            <w:r>
+              <w:t xml:space="preserve">0.636–0.970 </w:t>
+            </w:r>
+            <w:proofErr w:type="spellStart"/>
+            <w:r>
+              <w:t>ms</w:t>
+            </w:r>
+            <w:proofErr w:type="spellEnd"/>
+          </w:p>
+        </w:tc>
+        <w:tc>
+          <w:tcPr>
+            <w:tcW w:w="0" w:type="auto"/>
+            <w:vAlign w:val="center"/>
+            <w:hideMark/>
+          </w:tcPr>
+          <w:p>
+            <w:r>
+              <w:t xml:space="preserve">0.147–0.212 </w:t>
+            </w:r>
+            <w:proofErr w:type="spellStart"/>
+            <w:r>
+              <w:t>ms</w:t>
+            </w:r>
+            <w:proofErr w:type="spellEnd"/>
+          </w:p>
+        </w:tc>
+      </w:tr>
+      <w:tr>
+        <w:trPr>
+          <w:tblCellSpacing w:w="15" w:type="dxa"/>
+        </w:trPr>
+        <w:tc>
+          <w:tcPr>
+            <w:tcW w:w="2470" w:type="dxa"/>
+            <w:vAlign w:val="center"/>
+            <w:hideMark/>
+          </w:tcPr>
+          <w:p>
+            <w:r>
+              <w:t>Result equivalence</w:t>
+            </w:r>
+          </w:p>
+        </w:tc>
+        <w:tc>
+          <w:tcPr>
+            <w:tcW w:w="2492" w:type="dxa"/>
+            <w:vAlign w:val="center"/>
+            <w:hideMark/>
+          </w:tcPr>
+          <w:p>
+            <w:r>
+              <w:t>Baseline result</w:t>
+            </w:r>
+          </w:p>
+        </w:tc>
+        <w:tc>
+          <w:tcPr>
+            <w:tcW w:w="0" w:type="auto"/>
+            <w:vAlign w:val="center"/>
+            <w:hideMark/>
+          </w:tcPr>
+          <w:p>
+            <w:r>
+              <w:t>Same 18 rows</w:t>
+            </w:r>
+          </w:p>
+        </w:tc>
+      </w:tr>
+      <w:tr>
+        <w:trPr>
+          <w:tblCellSpacing w:w="15" w:type="dxa"/>
+        </w:trPr>
+        <w:tc>
+          <w:tcPr>
+            <w:tcW w:w="2470" w:type="dxa"/>
+            <w:vAlign w:val="center"/>
+            <w:hideMark/>
+          </w:tcPr>
+          <w:p>
+            <w:r>
+              <w:lastRenderedPageBreak/>
+              <w:t>Performance observation</w:t>
+            </w:r>
+          </w:p>
+        </w:tc>
+        <w:tc>
+          <w:tcPr>
+            <w:tcW w:w="2492" w:type="dxa"/>
+            <w:vAlign w:val="center"/>
+            <w:hideMark/>
+          </w:tcPr>
+          <w:p>
+            <w:r>
+              <w:t>Scanned the entire table</w:t>
+            </w:r>
+          </w:p>
+        </w:tc>
+        <w:tc>
+          <w:tcPr>
+            <w:tcW w:w="0" w:type="auto"/>
+            <w:vAlign w:val="center"/>
+            <w:hideMark/>
+          </w:tcPr>
+          <w:p>
+            <w:r>
+              <w:t>Targeted index access reduced the amount of data processed</w:t>
+            </w:r>
+          </w:p>
+        </w:tc>
+      </w:tr>
+      <w:tr>
+        <w:trPr>
+          <w:tblCellSpacing w:w="15" w:type="dxa"/>
+        </w:trPr>
+        <w:tc>
+          <w:tcPr>
+            <w:tcW w:w="2470" w:type="dxa"/>
+            <w:vAlign w:val="center"/>
+            <w:hideMark/>
+          </w:tcPr>
+          <w:p>
+            <w:r>
+              <w:t>Conclusion</w:t>
+            </w:r>
+          </w:p>
+        </w:tc>
+        <w:tc>
+          <w:tcPr>
+            <w:tcW w:w="2492" w:type="dxa"/>
+            <w:vAlign w:val="center"/>
+            <w:hideMark/>
+          </w:tcPr>
+          <w:p>
+            <w:r>
+              <w:t xml:space="preserve">Applying </w:t>
+            </w:r>
+            <w:proofErr w:type="gramStart"/>
+            <w:r>
+              <w:t>DATE(</w:t>
+            </w:r>
+            <w:proofErr w:type="gramEnd"/>
+            <w:r>
+              <w:t>) to the column prevented effective range access</w:t>
+            </w:r>
+          </w:p>
+        </w:tc>
+        <w:tc>
+          <w:tcPr>
+            <w:tcW w:w="0" w:type="auto"/>
+            <w:vAlign w:val="center"/>
+            <w:hideMark/>
+          </w:tcPr>
+          <w:p>
+            <w:r>
+              <w:t>Improved access plan and lower observed execution time</w:t>
+            </w:r>
+          </w:p>
+        </w:tc>
+      </w:tr>
+    </w:tbl>
     <w:p/>
     <w:sectPr>
       <w:pgSz w:w="12240" w:h="15840"/>
@@ -1595,7 +2286,6 @@
   <w:style w:type="character" w:default="1" w:styleId="DefaultParagraphFont">
     <w:name w:val="Default Paragraph Font"/>
     <w:uiPriority w:val="1"/>
-    <w:semiHidden/>
     <w:unhideWhenUsed/>
   </w:style>
   <w:style w:type="table" w:default="1" w:styleId="TableNormal">

</xml_diff>